<commit_message>
Protokoll-Zusammenfassung endet mit konkreten naechsten Schritten
Der Abschnitt "Noch offen" mit der Liste unbeantworteter Fragen ist ersetzt durch
"Naechste Schritte" mit drei Punkten: Upload der Rohdaten in den freigegebenen
OneDrive-Ordner, Pruefung und Zeichnung der NDA, Budgetplan durch CertoClav.

Ausserdem:
- Die Fuenf-Schritte-Tabelle unter "Was danach passiert" entfaellt, da die
  Schritte jetzt am Dokumentende stehen; der erklaerende Absatz bleibt
- NDA-Formulierung angepasst: die Vorlage liegt bei, statt auf Wunsch zugesandt
  zu werden - passend dazu, dass sie mitgeschickt wird

Co-Authored-By: Claude Opus 5 <noreply@anthropic.com>
Claude-Session: https://claude.ai/code/session_01GFfZvJBCzXCmDgx3EnU1YB
</commit_message>
<xml_diff>
--- a/02_Meetings/2026-08-17_discovery-call_zusammenfassung.docx
+++ b/02_Meetings/2026-08-17_discovery-call_zusammenfassung.docx
@@ -819,328 +819,6 @@
         <w:t>Aus den bereitgestellten Unterlagen leiten wir die konkreten Anforderungen ab. Erst diese Auswertung erlaubt eine belastbare Aussage zu Aufwand, Budget und Zeitplan – eine Schätzung vor der Datenauswertung wäre geraten und für keine Seite hilfreich.</w:t>
       </w:r>
     </w:p>
-    <w:tbl>
-      <w:tblPr>
-        <w:tblStyle w:val="TableGrid"/>
-        <w:tblW w:type="auto" w:w="0"/>
-        <w:jc w:val="left"/>
-        <w:tblLook w:firstColumn="1" w:firstRow="1" w:lastColumn="0" w:lastRow="0" w:noHBand="0" w:noVBand="1" w:val="04A0"/>
-      </w:tblPr>
-      <w:tblGrid>
-        <w:gridCol w:w="3213"/>
-        <w:gridCol w:w="3213"/>
-        <w:gridCol w:w="3213"/>
-      </w:tblGrid>
-      <w:tr>
-        <w:tc>
-          <w:tcPr>
-            <w:tcW w:type="dxa" w:w="2268"/>
-            <w:shd w:val="clear" w:fill="1F4E79"/>
-          </w:tcPr>
-          <w:p>
-            <w:pPr>
-              <w:spacing w:after="0"/>
-            </w:pPr>
-            <w:r>
-              <w:rPr>
-                <w:b/>
-                <w:color w:val="FFFFFF"/>
-                <w:sz w:val="19"/>
-              </w:rPr>
-              <w:t>Schritt</w:t>
-            </w:r>
-          </w:p>
-        </w:tc>
-        <w:tc>
-          <w:tcPr>
-            <w:tcW w:type="dxa" w:w="5443"/>
-            <w:shd w:val="clear" w:fill="1F4E79"/>
-          </w:tcPr>
-          <w:p>
-            <w:pPr>
-              <w:spacing w:after="0"/>
-            </w:pPr>
-            <w:r>
-              <w:rPr>
-                <w:b/>
-                <w:color w:val="FFFFFF"/>
-                <w:sz w:val="19"/>
-              </w:rPr>
-              <w:t>Inhalt</w:t>
-            </w:r>
-          </w:p>
-        </w:tc>
-        <w:tc>
-          <w:tcPr>
-            <w:tcW w:type="dxa" w:w="1928"/>
-            <w:shd w:val="clear" w:fill="1F4E79"/>
-          </w:tcPr>
-          <w:p>
-            <w:pPr>
-              <w:spacing w:after="0"/>
-            </w:pPr>
-            <w:r>
-              <w:rPr>
-                <w:b/>
-                <w:color w:val="FFFFFF"/>
-                <w:sz w:val="19"/>
-              </w:rPr>
-              <w:t>Wer</w:t>
-            </w:r>
-          </w:p>
-        </w:tc>
-      </w:tr>
-      <w:tr>
-        <w:tc>
-          <w:tcPr>
-            <w:tcW w:type="dxa" w:w="2268"/>
-          </w:tcPr>
-          <w:p>
-            <w:pPr>
-              <w:spacing w:after="0"/>
-            </w:pPr>
-            <w:r>
-              <w:rPr>
-                <w:sz w:val="19"/>
-              </w:rPr>
-              <w:t>1 · Upload</w:t>
-            </w:r>
-          </w:p>
-        </w:tc>
-        <w:tc>
-          <w:tcPr>
-            <w:tcW w:type="dxa" w:w="5443"/>
-          </w:tcPr>
-          <w:p>
-            <w:pPr>
-              <w:spacing w:after="0"/>
-            </w:pPr>
-            <w:r>
-              <w:rPr>
-                <w:sz w:val="19"/>
-              </w:rPr>
-              <w:t>biotec stellt die Unterlagen aus Paket 1 bereit</w:t>
-            </w:r>
-          </w:p>
-        </w:tc>
-        <w:tc>
-          <w:tcPr>
-            <w:tcW w:type="dxa" w:w="1928"/>
-          </w:tcPr>
-          <w:p>
-            <w:pPr>
-              <w:spacing w:after="0"/>
-            </w:pPr>
-            <w:r>
-              <w:rPr>
-                <w:sz w:val="19"/>
-              </w:rPr>
-              <w:t>biotec</w:t>
-            </w:r>
-          </w:p>
-        </w:tc>
-      </w:tr>
-      <w:tr>
-        <w:tc>
-          <w:tcPr>
-            <w:tcW w:type="dxa" w:w="2268"/>
-          </w:tcPr>
-          <w:p>
-            <w:pPr>
-              <w:spacing w:after="0"/>
-            </w:pPr>
-            <w:r>
-              <w:rPr>
-                <w:sz w:val="19"/>
-              </w:rPr>
-              <w:t>2 · Auswertung</w:t>
-            </w:r>
-          </w:p>
-        </w:tc>
-        <w:tc>
-          <w:tcPr>
-            <w:tcW w:type="dxa" w:w="5443"/>
-          </w:tcPr>
-          <w:p>
-            <w:pPr>
-              <w:spacing w:after="0"/>
-            </w:pPr>
-            <w:r>
-              <w:rPr>
-                <w:sz w:val="19"/>
-              </w:rPr>
-              <w:t>Wir prüfen Datenmenge, Datenqualität, Dokumentenvorlagen und die Struktur des Altsystems und stellen Rückfragen</w:t>
-            </w:r>
-          </w:p>
-        </w:tc>
-        <w:tc>
-          <w:tcPr>
-            <w:tcW w:type="dxa" w:w="1928"/>
-          </w:tcPr>
-          <w:p>
-            <w:pPr>
-              <w:spacing w:after="0"/>
-            </w:pPr>
-            <w:r>
-              <w:rPr>
-                <w:sz w:val="19"/>
-              </w:rPr>
-              <w:t>CertoClav</w:t>
-            </w:r>
-          </w:p>
-        </w:tc>
-      </w:tr>
-      <w:tr>
-        <w:tc>
-          <w:tcPr>
-            <w:tcW w:type="dxa" w:w="2268"/>
-          </w:tcPr>
-          <w:p>
-            <w:pPr>
-              <w:spacing w:after="0"/>
-            </w:pPr>
-            <w:r>
-              <w:rPr>
-                <w:sz w:val="19"/>
-              </w:rPr>
-              <w:t>3 · Scoping</w:t>
-            </w:r>
-          </w:p>
-        </w:tc>
-        <w:tc>
-          <w:tcPr>
-            <w:tcW w:type="dxa" w:w="5443"/>
-          </w:tcPr>
-          <w:p>
-            <w:pPr>
-              <w:spacing w:after="0"/>
-            </w:pPr>
-            <w:r>
-              <w:rPr>
-                <w:sz w:val="19"/>
-              </w:rPr>
-              <w:t>Umfang je Phase, Reihenfolge der Themen, Abgrenzung dessen, was bewusst später kommt</w:t>
-            </w:r>
-          </w:p>
-        </w:tc>
-        <w:tc>
-          <w:tcPr>
-            <w:tcW w:type="dxa" w:w="1928"/>
-          </w:tcPr>
-          <w:p>
-            <w:pPr>
-              <w:spacing w:after="0"/>
-            </w:pPr>
-            <w:r>
-              <w:rPr>
-                <w:sz w:val="19"/>
-              </w:rPr>
-              <w:t>CertoClav</w:t>
-            </w:r>
-          </w:p>
-        </w:tc>
-      </w:tr>
-      <w:tr>
-        <w:tc>
-          <w:tcPr>
-            <w:tcW w:type="dxa" w:w="2268"/>
-          </w:tcPr>
-          <w:p>
-            <w:pPr>
-              <w:spacing w:after="0"/>
-            </w:pPr>
-            <w:r>
-              <w:rPr>
-                <w:sz w:val="19"/>
-              </w:rPr>
-              <w:t>4 · Budget &amp; Projektplan</w:t>
-            </w:r>
-          </w:p>
-        </w:tc>
-        <w:tc>
-          <w:tcPr>
-            <w:tcW w:type="dxa" w:w="5443"/>
-          </w:tcPr>
-          <w:p>
-            <w:pPr>
-              <w:spacing w:after="0"/>
-            </w:pPr>
-            <w:r>
-              <w:rPr>
-                <w:sz w:val="19"/>
-              </w:rPr>
-              <w:t>Aufwandsschätzung, Phasenplan mit Terminen, Vorschlag für den Go-live</w:t>
-            </w:r>
-          </w:p>
-        </w:tc>
-        <w:tc>
-          <w:tcPr>
-            <w:tcW w:type="dxa" w:w="1928"/>
-          </w:tcPr>
-          <w:p>
-            <w:pPr>
-              <w:spacing w:after="0"/>
-            </w:pPr>
-            <w:r>
-              <w:rPr>
-                <w:sz w:val="19"/>
-              </w:rPr>
-              <w:t>CertoClav</w:t>
-            </w:r>
-          </w:p>
-        </w:tc>
-      </w:tr>
-      <w:tr>
-        <w:tc>
-          <w:tcPr>
-            <w:tcW w:type="dxa" w:w="2268"/>
-          </w:tcPr>
-          <w:p>
-            <w:pPr>
-              <w:spacing w:after="0"/>
-            </w:pPr>
-            <w:r>
-              <w:rPr>
-                <w:sz w:val="19"/>
-              </w:rPr>
-              <w:t>5 · Entscheidung</w:t>
-            </w:r>
-          </w:p>
-        </w:tc>
-        <w:tc>
-          <w:tcPr>
-            <w:tcW w:type="dxa" w:w="5443"/>
-          </w:tcPr>
-          <w:p>
-            <w:pPr>
-              <w:spacing w:after="0"/>
-            </w:pPr>
-            <w:r>
-              <w:rPr>
-                <w:sz w:val="19"/>
-              </w:rPr>
-              <w:t>Freigabe und Kick-Off-Termin</w:t>
-            </w:r>
-          </w:p>
-        </w:tc>
-        <w:tc>
-          <w:tcPr>
-            <w:tcW w:type="dxa" w:w="1928"/>
-          </w:tcPr>
-          <w:p>
-            <w:pPr>
-              <w:spacing w:after="0"/>
-            </w:pPr>
-            <w:r>
-              <w:rPr>
-                <w:sz w:val="19"/>
-              </w:rPr>
-              <w:t>gemeinsam</w:t>
-            </w:r>
-          </w:p>
-        </w:tc>
-      </w:tr>
-    </w:tbl>
     <w:p>
       <w:pPr>
         <w:spacing w:before="280" w:after="120"/>
@@ -1178,7 +856,7 @@
           <w:b/>
           <w:sz w:val="21"/>
         </w:rPr>
-        <w:t>Auf Wunsch senden wir Ihnen gerne eine Vorlage für eine Vertraulichkeitsvereinbarung (NDA) zu, die wir vor der Übergabe der Unterlagen zeichnen. Sagen Sie uns einfach Bescheid.</w:t>
+        <w:t>Eine Vorlage für eine Vertraulichkeitsvereinbarung (NDA) liegt diesem Protokoll bei. Wenn sie so für Sie passt, senden Sie sie gezeichnet an michael.simon@certoclav.com – gerne vor der Übergabe der Unterlagen. Falls Sie eine eigene Fassung bevorzugen, sagen Sie uns Bescheid.</w:t>
       </w:r>
     </w:p>
     <w:p>
@@ -1195,7 +873,21 @@
     </w:p>
     <w:p>
       <w:pPr>
-        <w:spacing w:before="280" w:after="120"/>
+        <w:spacing w:before="280" w:after="0"/>
+      </w:pPr>
+      <w:r>
+        <w:rPr>
+          <w:rFonts w:ascii="Calibri" w:hAnsi="Calibri"/>
+          <w:b/>
+          <w:color w:val="7F7F7F"/>
+          <w:sz w:val="15"/>
+        </w:rPr>
+        <w:t>WAS JETZT ZU TUN IST</w:t>
+      </w:r>
+    </w:p>
+    <w:p>
+      <w:pPr>
+        <w:spacing w:before="40" w:after="120"/>
         <w:pBdr>
           <w:bottom w:val="single" w:sz="8" w:space="2" w:color="1F4E79"/>
         </w:pBdr>
@@ -1206,67 +898,231 @@
           <w:color w:val="1F4E79"/>
           <w:sz w:val="26"/>
         </w:rPr>
-        <w:t>Noch offen</w:t>
+        <w:t>Nächste Schritte</w:t>
       </w:r>
     </w:p>
-    <w:p>
-      <w:pPr>
-        <w:spacing w:after="40"/>
-      </w:pPr>
-      <w:r>
-        <w:rPr>
-          <w:i/>
-          <w:color w:val="7F7F7F"/>
-          <w:sz w:val="18"/>
-        </w:rPr>
-        <w:t>Punkte, die im Termin nicht besprochen wurden und die wir im weiteren Verlauf klären.</w:t>
-      </w:r>
-    </w:p>
-    <w:p>
-      <w:pPr>
-        <w:spacing w:before="20" w:after="20"/>
-        <w:ind w:left="397"/>
-      </w:pPr>
-      <w:r>
-        <w:t>– Wunschtermin für den Go-live und was ihn treibt.</w:t>
-      </w:r>
-    </w:p>
-    <w:p>
-      <w:pPr>
-        <w:spacing w:before="20" w:after="20"/>
-        <w:ind w:left="397"/>
-      </w:pPr>
-      <w:r>
-        <w:t>– Budgetrahmen und Entscheidungsweg.</w:t>
-      </w:r>
-    </w:p>
-    <w:p>
-      <w:pPr>
-        <w:spacing w:before="20" w:after="20"/>
-        <w:ind w:left="397"/>
-      </w:pPr>
-      <w:r>
-        <w:t>– Anzahl der späteren Odoo-Nutzer und deren Rollen.</w:t>
-      </w:r>
-    </w:p>
-    <w:p>
-      <w:pPr>
-        <w:spacing w:before="20" w:after="20"/>
-        <w:ind w:left="397"/>
-      </w:pPr>
-      <w:r>
-        <w:t>– Gesellschaftsstruktur der drei Standorte – daraus ergibt sich, ob Odoo als eine oder als mehrere Gesellschaften eingerichtet wird.</w:t>
-      </w:r>
-    </w:p>
-    <w:p>
-      <w:pPr>
-        <w:spacing w:before="20" w:after="20"/>
-        <w:ind w:left="397"/>
-      </w:pPr>
-      <w:r>
-        <w:t>– Ob die Anforderungen der Certania-Gruppe an Beschaffung, Fakturierung und Projektbewertung Teil dieses Projekts sind.</w:t>
-      </w:r>
-    </w:p>
+    <w:tbl>
+      <w:tblPr>
+        <w:tblStyle w:val="TableGrid"/>
+        <w:tblW w:type="auto" w:w="0"/>
+        <w:jc w:val="left"/>
+        <w:tblLook w:firstColumn="1" w:firstRow="1" w:lastColumn="0" w:lastRow="0" w:noHBand="0" w:noVBand="1" w:val="04A0"/>
+      </w:tblPr>
+      <w:tblGrid>
+        <w:gridCol w:w="3213"/>
+        <w:gridCol w:w="3213"/>
+        <w:gridCol w:w="3213"/>
+      </w:tblGrid>
+      <w:tr>
+        <w:tc>
+          <w:tcPr>
+            <w:tcW w:type="dxa" w:w="680"/>
+            <w:shd w:val="clear" w:fill="1F4E79"/>
+          </w:tcPr>
+          <w:p>
+            <w:pPr>
+              <w:spacing w:after="0"/>
+            </w:pPr>
+            <w:r>
+              <w:rPr>
+                <w:b/>
+                <w:color w:val="FFFFFF"/>
+                <w:sz w:val="19"/>
+              </w:rPr>
+              <w:t>Nr.</w:t>
+            </w:r>
+          </w:p>
+        </w:tc>
+        <w:tc>
+          <w:tcPr>
+            <w:tcW w:type="dxa" w:w="7030"/>
+            <w:shd w:val="clear" w:fill="1F4E79"/>
+          </w:tcPr>
+          <w:p>
+            <w:pPr>
+              <w:spacing w:after="0"/>
+            </w:pPr>
+            <w:r>
+              <w:rPr>
+                <w:b/>
+                <w:color w:val="FFFFFF"/>
+                <w:sz w:val="19"/>
+              </w:rPr>
+              <w:t>Schritt</w:t>
+            </w:r>
+          </w:p>
+        </w:tc>
+        <w:tc>
+          <w:tcPr>
+            <w:tcW w:type="dxa" w:w="1928"/>
+            <w:shd w:val="clear" w:fill="1F4E79"/>
+          </w:tcPr>
+          <w:p>
+            <w:pPr>
+              <w:spacing w:after="0"/>
+            </w:pPr>
+            <w:r>
+              <w:rPr>
+                <w:b/>
+                <w:color w:val="FFFFFF"/>
+                <w:sz w:val="19"/>
+              </w:rPr>
+              <w:t>Wer</w:t>
+            </w:r>
+          </w:p>
+        </w:tc>
+      </w:tr>
+      <w:tr>
+        <w:tc>
+          <w:tcPr>
+            <w:tcW w:type="dxa" w:w="680"/>
+          </w:tcPr>
+          <w:p>
+            <w:pPr>
+              <w:spacing w:after="0"/>
+            </w:pPr>
+            <w:r>
+              <w:rPr>
+                <w:sz w:val="19"/>
+              </w:rPr>
+              <w:t>1</w:t>
+            </w:r>
+          </w:p>
+        </w:tc>
+        <w:tc>
+          <w:tcPr>
+            <w:tcW w:type="dxa" w:w="7030"/>
+          </w:tcPr>
+          <w:p>
+            <w:pPr>
+              <w:spacing w:after="0"/>
+            </w:pPr>
+            <w:r>
+              <w:rPr>
+                <w:sz w:val="19"/>
+              </w:rPr>
+              <w:t>Rohdaten in den freigegebenen OneDrive-Ordner hochladen. Welche Unterlagen wir brauchen, steht in der Datenanforderung (Datenanforderung_biotec.docx) – gelb markiert ist, was wir zuerst benötigen. Der Ordner ist für Michael Brand und Nicole Krupa freigegeben.</w:t>
+            </w:r>
+          </w:p>
+        </w:tc>
+        <w:tc>
+          <w:tcPr>
+            <w:tcW w:type="dxa" w:w="1928"/>
+          </w:tcPr>
+          <w:p>
+            <w:pPr>
+              <w:spacing w:after="0"/>
+            </w:pPr>
+            <w:r>
+              <w:rPr>
+                <w:sz w:val="19"/>
+              </w:rPr>
+              <w:t>biotec</w:t>
+            </w:r>
+          </w:p>
+        </w:tc>
+      </w:tr>
+      <w:tr>
+        <w:tc>
+          <w:tcPr>
+            <w:tcW w:type="dxa" w:w="680"/>
+          </w:tcPr>
+          <w:p>
+            <w:pPr>
+              <w:spacing w:after="0"/>
+            </w:pPr>
+            <w:r>
+              <w:rPr>
+                <w:sz w:val="19"/>
+              </w:rPr>
+              <w:t>2</w:t>
+            </w:r>
+          </w:p>
+        </w:tc>
+        <w:tc>
+          <w:tcPr>
+            <w:tcW w:type="dxa" w:w="7030"/>
+          </w:tcPr>
+          <w:p>
+            <w:pPr>
+              <w:spacing w:after="0"/>
+            </w:pPr>
+            <w:r>
+              <w:rPr>
+                <w:sz w:val="19"/>
+              </w:rPr>
+              <w:t>Vertraulichkeitsvereinbarung prüfen und, wenn sie so passt, unterschrieben an michael.simon@certoclav.com senden.</w:t>
+            </w:r>
+          </w:p>
+        </w:tc>
+        <w:tc>
+          <w:tcPr>
+            <w:tcW w:type="dxa" w:w="1928"/>
+          </w:tcPr>
+          <w:p>
+            <w:pPr>
+              <w:spacing w:after="0"/>
+            </w:pPr>
+            <w:r>
+              <w:rPr>
+                <w:sz w:val="19"/>
+              </w:rPr>
+              <w:t>biotec</w:t>
+            </w:r>
+          </w:p>
+        </w:tc>
+      </w:tr>
+      <w:tr>
+        <w:tc>
+          <w:tcPr>
+            <w:tcW w:type="dxa" w:w="680"/>
+          </w:tcPr>
+          <w:p>
+            <w:pPr>
+              <w:spacing w:after="0"/>
+            </w:pPr>
+            <w:r>
+              <w:rPr>
+                <w:sz w:val="19"/>
+              </w:rPr>
+              <w:t>3</w:t>
+            </w:r>
+          </w:p>
+        </w:tc>
+        <w:tc>
+          <w:tcPr>
+            <w:tcW w:type="dxa" w:w="7030"/>
+          </w:tcPr>
+          <w:p>
+            <w:pPr>
+              <w:spacing w:after="0"/>
+            </w:pPr>
+            <w:r>
+              <w:rPr>
+                <w:sz w:val="19"/>
+              </w:rPr>
+              <w:t>Budgetplan auf Basis der hochgeladenen Daten erstellen.</w:t>
+            </w:r>
+          </w:p>
+        </w:tc>
+        <w:tc>
+          <w:tcPr>
+            <w:tcW w:type="dxa" w:w="1928"/>
+          </w:tcPr>
+          <w:p>
+            <w:pPr>
+              <w:spacing w:after="0"/>
+            </w:pPr>
+            <w:r>
+              <w:rPr>
+                <w:sz w:val="19"/>
+              </w:rPr>
+              <w:t>CertoClav</w:t>
+            </w:r>
+          </w:p>
+        </w:tc>
+      </w:tr>
+    </w:tbl>
     <w:p>
       <w:pPr>
         <w:spacing w:before="280" w:after="120"/>

</xml_diff>